<commit_message>
feat: add semantic/natural-language search mode selector
Adds a config-gated Keyword / Semantic Search / Natural Language mode
selector next to the search bar, wired through the existing URL-param
and reactive-state patterns. Defaults to today's plain keyword search
when unconfigured, matching the API's own FULLTEXT default.

Also fixes two bugs found while wiring this up:
- buildMatchQuery sent a `fields` array unconditionally, which the
  search API's discriminator-mapped schema only allows for FULLTEXT
  mode — HYBRID/NATURAL_LANGUAGE were rejected as a deserialization
  error. Now `fields` is only included for FULLTEXT.
- The Worker forwarded a stale Content-Length header after
  re-serializing the search body with injected auth clauses, which
  could misframe the request body upstream.

Co-Authored-By: Claude Sonnet 5 <noreply@anthropic.com>
</commit_message>
<xml_diff>
--- a/docs/da-content/index.docx
+++ b/docs/da-content/index.docx
@@ -54,7 +54,9 @@
             <w:tcW w:type="dxa" w:w="4320"/>
           </w:tcPr>
           <w:p>
-            <w:r/>
+            <w:r>
+              <w:t>enableSemanticSearch</w:t>
+            </w:r>
           </w:p>
         </w:tc>
         <w:tc>
@@ -62,7 +64,31 @@
             <w:tcW w:type="dxa" w:w="4320"/>
           </w:tcPr>
           <w:p>
-            <w:r/>
+            <w:r>
+              <w:t>true</w:t>
+            </w:r>
+          </w:p>
+        </w:tc>
+      </w:tr>
+      <w:tr>
+        <w:tc>
+          <w:tcPr>
+            <w:tcW w:type="dxa" w:w="4320"/>
+          </w:tcPr>
+          <w:p>
+            <w:r>
+              <w:t>enableNaturalLanguageSearch</w:t>
+            </w:r>
+          </w:p>
+        </w:tc>
+        <w:tc>
+          <w:tcPr>
+            <w:tcW w:type="dxa" w:w="4320"/>
+          </w:tcPr>
+          <w:p>
+            <w:r>
+              <w:t>true</w:t>
+            </w:r>
           </w:p>
         </w:tc>
       </w:tr>

</xml_diff>

<commit_message>
fix: remove NATURAL_LANGUAGE search mode
Natural Language mode was returning 403 from the backend (likely an
authorization/entitlement gap on the sandbox tenant) and had no
confirmed working path. Dropping it keeps the mode selector limited
to Keyword and Semantic Search (HYBRID), both verified working.

Co-Authored-By: Claude Sonnet 5 <noreply@anthropic.com>
</commit_message>
<xml_diff>
--- a/docs/da-content/index.docx
+++ b/docs/da-content/index.docx
@@ -56,28 +56,6 @@
           <w:p>
             <w:r>
               <w:t>enableSemanticSearch</w:t>
-            </w:r>
-          </w:p>
-        </w:tc>
-        <w:tc>
-          <w:tcPr>
-            <w:tcW w:type="dxa" w:w="4320"/>
-          </w:tcPr>
-          <w:p>
-            <w:r>
-              <w:t>true</w:t>
-            </w:r>
-          </w:p>
-        </w:tc>
-      </w:tr>
-      <w:tr>
-        <w:tc>
-          <w:tcPr>
-            <w:tcW w:type="dxa" w:w="4320"/>
-          </w:tcPr>
-          <w:p>
-            <w:r>
-              <w:t>enableNaturalLanguageSearch</w:t>
             </w:r>
           </w:p>
         </w:tc>

</xml_diff>